<commit_message>
Textentwruf und zugehörige überarbeitet/ hinzugefügt zu FNO-Modell und Space Chargeund mit Anmerkungen
</commit_message>
<xml_diff>
--- a/Konzeptionierung/Textentwürfe/2026-10-14_Methodology FNO.docx
+++ b/Konzeptionierung/Textentwürfe/2026-10-14_Methodology FNO.docx
@@ -4,29 +4,115 @@
   <w:body>
     <w:p>
       <w:pPr>
-        <w:rPr>
-          <w:lang w:val="en-US"/>
-        </w:rPr>
-      </w:pPr>
-      <w:r>
-        <w:rPr>
-          <w:lang w:val="en-US"/>
-        </w:rPr>
-        <w:t xml:space="preserve">Regarding lifting Input with </w:t>
-      </w:r>
-      <w:proofErr w:type="spellStart"/>
-      <w:r>
-        <w:rPr>
-          <w:lang w:val="en-US"/>
-        </w:rPr>
-        <w:t>P at</w:t>
-      </w:r>
-      <w:proofErr w:type="spellEnd"/>
-      <w:r>
-        <w:rPr>
-          <w:lang w:val="en-US"/>
-        </w:rPr>
-        <w:t xml:space="preserve"> beginning and </w:t>
+        <w:pStyle w:val="berschrift1"/>
+        <w:rPr>
+          <w:lang w:val="en-US"/>
+        </w:rPr>
+      </w:pPr>
+      <w:r>
+        <w:rPr>
+          <w:lang w:val="en-US"/>
+        </w:rPr>
+        <w:t>Research Questions (For Intro – ask Profs)</w:t>
+      </w:r>
+    </w:p>
+    <w:p>
+      <w:pPr>
+        <w:rPr>
+          <w:lang w:val="en-US"/>
+        </w:rPr>
+      </w:pPr>
+      <w:r>
+        <w:rPr>
+          <w:lang w:val="en-US"/>
+        </w:rPr>
+        <w:t>How is Space Charge simulation tackled so far?</w:t>
+      </w:r>
+    </w:p>
+    <w:p>
+      <w:pPr>
+        <w:rPr>
+          <w:lang w:val="en-US"/>
+        </w:rPr>
+      </w:pPr>
+      <w:r>
+        <w:rPr>
+          <w:lang w:val="en-US"/>
+        </w:rPr>
+        <w:t>How are beamline simulations tackled so far?</w:t>
+      </w:r>
+    </w:p>
+    <w:p>
+      <w:pPr>
+        <w:rPr>
+          <w:lang w:val="en-US"/>
+        </w:rPr>
+      </w:pPr>
+      <w:r>
+        <w:rPr>
+          <w:lang w:val="en-US"/>
+        </w:rPr>
+        <w:t>What have been the challenges?</w:t>
+      </w:r>
+    </w:p>
+    <w:p>
+      <w:pPr>
+        <w:rPr>
+          <w:lang w:val="en-US"/>
+        </w:rPr>
+      </w:pPr>
+      <w:r>
+        <w:rPr>
+          <w:lang w:val="en-US"/>
+        </w:rPr>
+        <w:t>Especially regarding computation of particles</w:t>
+      </w:r>
+    </w:p>
+    <w:p>
+      <w:pPr>
+        <w:rPr>
+          <w:lang w:val="en-US"/>
+        </w:rPr>
+      </w:pPr>
+      <w:r>
+        <w:rPr>
+          <w:lang w:val="en-US"/>
+        </w:rPr>
+        <w:t>Accuracy &amp; Time + Memory</w:t>
+      </w:r>
+    </w:p>
+    <w:p>
+      <w:pPr>
+        <w:rPr>
+          <w:lang w:val="en-US"/>
+        </w:rPr>
+      </w:pPr>
+    </w:p>
+    <w:p>
+      <w:pPr>
+        <w:pStyle w:val="berschrift1"/>
+        <w:rPr>
+          <w:lang w:val="en-US"/>
+        </w:rPr>
+      </w:pPr>
+      <w:r>
+        <w:rPr>
+          <w:lang w:val="en-US"/>
+        </w:rPr>
+        <w:t>Implementation of FNO in Cheetah</w:t>
+      </w:r>
+    </w:p>
+    <w:p>
+      <w:pPr>
+        <w:rPr>
+          <w:lang w:val="en-US"/>
+        </w:rPr>
+      </w:pPr>
+      <w:r>
+        <w:rPr>
+          <w:lang w:val="en-US"/>
+        </w:rPr>
+        <w:t xml:space="preserve">Regarding lifting Input with P at beginning and </w:t>
       </w:r>
       <w:r>
         <w:rPr>
@@ -44,21 +130,7 @@
         <w:rPr>
           <w:lang w:val="en-US"/>
         </w:rPr>
-        <w:t xml:space="preserve">rom channel_mlp.py:     </w:t>
-      </w:r>
-      <w:proofErr w:type="spellStart"/>
-      <w:r>
-        <w:rPr>
-          <w:lang w:val="en-US"/>
-        </w:rPr>
-        <w:t>ChannelMLP</w:t>
-      </w:r>
-      <w:proofErr w:type="spellEnd"/>
-      <w:r>
-        <w:rPr>
-          <w:lang w:val="en-US"/>
-        </w:rPr>
-        <w:t xml:space="preserve"> applies a series of 1D convolutions and nonlinearities to the channel</w:t>
+        <w:t>rom channel_mlp.py:     ChannelMLP applies a series of 1D convolutions and nonlinearities to the channel</w:t>
       </w:r>
     </w:p>
     <w:p>
@@ -147,275 +219,121 @@
       </w:r>
     </w:p>
     <w:p>
+      <w:pPr>
+        <w:rPr>
+          <w:lang w:val="en-US"/>
+        </w:rPr>
+      </w:pPr>
       <w:r>
         <w:rPr>
           <w:lang w:val="en-US"/>
         </w:rPr>
         <w:t xml:space="preserve">    </w:t>
       </w:r>
-      <w:proofErr w:type="spellStart"/>
-      <w:r>
-        <w:t>using</w:t>
-      </w:r>
-      <w:proofErr w:type="spellEnd"/>
-      <w:r>
-        <w:t xml:space="preserve"> fully </w:t>
-      </w:r>
-      <w:proofErr w:type="spellStart"/>
-      <w:r>
-        <w:t>connected</w:t>
-      </w:r>
-      <w:proofErr w:type="spellEnd"/>
-      <w:r>
-        <w:t xml:space="preserve"> </w:t>
-      </w:r>
-      <w:proofErr w:type="spellStart"/>
-      <w:r>
-        <w:t>layers</w:t>
-      </w:r>
-      <w:proofErr w:type="spellEnd"/>
-      <w:r>
-        <w:t>.</w:t>
+      <w:r>
+        <w:rPr>
+          <w:lang w:val="en-US"/>
+        </w:rPr>
+        <w:t>using fully connected layers.</w:t>
+      </w:r>
+    </w:p>
+    <w:p>
+      <w:pPr>
+        <w:rPr>
+          <w:lang w:val="en-US"/>
+        </w:rPr>
+      </w:pPr>
+    </w:p>
+    <w:p>
+      <w:pPr>
+        <w:rPr>
+          <w:lang w:val="en-US"/>
+        </w:rPr>
+      </w:pPr>
+      <w:r>
+        <w:rPr>
+          <w:lang w:val="en-US"/>
+        </w:rPr>
+        <w:t>Ergebniss inspect_scaling.py (14.10.2026):</w:t>
+      </w:r>
+    </w:p>
+    <w:p>
+      <w:r>
+        <w:t>Datensatz: data/cheetah_sc_train_16.h5, 16 Proben, Gitter (16, 16, 16)</w:t>
       </w:r>
     </w:p>
     <w:p/>
     <w:p>
-      <w:proofErr w:type="spellStart"/>
-      <w:r>
-        <w:t>Ergebniss</w:t>
-      </w:r>
-      <w:proofErr w:type="spellEnd"/>
-      <w:r>
-        <w:t xml:space="preserve"> inspect_scaling.py (14.10.2026):</w:t>
-      </w:r>
-    </w:p>
-    <w:p>
-      <w:r>
-        <w:t xml:space="preserve">Datensatz: </w:t>
-      </w:r>
-      <w:proofErr w:type="spellStart"/>
-      <w:r>
-        <w:t>data</w:t>
-      </w:r>
-      <w:proofErr w:type="spellEnd"/>
-      <w:r>
-        <w:t>/cheetah_sc_train_16.h5, 16 Proben, Gitter (16, 16, 16)</w:t>
+      <w:r>
+        <w:t>Rohe Groessen (das, was ohne Entdimensionalisierung ins Netz ginge):</w:t>
+      </w:r>
+    </w:p>
+    <w:p>
+      <w:r>
+        <w:t xml:space="preserve">  Gesamtladung    :  0.84 Dekaden</w:t>
+      </w:r>
+    </w:p>
+    <w:p>
+      <w:r>
+        <w:t xml:space="preserve">  Zellgroesse dx  :  2.13 Dekaden</w:t>
+      </w:r>
+    </w:p>
+    <w:p>
+      <w:r>
+        <w:t xml:space="preserve">  gamma           : 114.3 .. 283.6</w:t>
       </w:r>
     </w:p>
     <w:p/>
     <w:p>
       <w:r>
-        <w:t xml:space="preserve">Rohe </w:t>
-      </w:r>
-      <w:proofErr w:type="spellStart"/>
-      <w:r>
-        <w:t>Groessen</w:t>
-      </w:r>
-      <w:proofErr w:type="spellEnd"/>
-      <w:r>
-        <w:t xml:space="preserve"> (das, was ohne </w:t>
-      </w:r>
-      <w:proofErr w:type="spellStart"/>
-      <w:r>
-        <w:t>Entdimensionalisierung</w:t>
-      </w:r>
-      <w:proofErr w:type="spellEnd"/>
-      <w:r>
-        <w:t xml:space="preserve"> ins Netz ginge):</w:t>
-      </w:r>
-    </w:p>
-    <w:p>
-      <w:r>
-        <w:t xml:space="preserve">  Gesamtladung    :  0.84 Dekaden</w:t>
-      </w:r>
-    </w:p>
-    <w:p>
-      <w:r>
-        <w:t xml:space="preserve">  </w:t>
-      </w:r>
-      <w:proofErr w:type="spellStart"/>
-      <w:r>
-        <w:t>Zellgroesse</w:t>
-      </w:r>
-      <w:proofErr w:type="spellEnd"/>
-      <w:r>
-        <w:t xml:space="preserve"> dx  :  2.13 Dekaden</w:t>
-      </w:r>
-    </w:p>
-    <w:p>
-      <w:r>
-        <w:t xml:space="preserve">  </w:t>
-      </w:r>
-      <w:proofErr w:type="spellStart"/>
-      <w:r>
-        <w:t>gamma</w:t>
-      </w:r>
-      <w:proofErr w:type="spellEnd"/>
-      <w:r>
-        <w:t xml:space="preserve">           : 114.3 .. 283.6</w:t>
+        <w:t>Nach Entdimensionalisierung, Streuung von std(phi_hat):</w:t>
+      </w:r>
+    </w:p>
+    <w:p>
+      <w:r>
+        <w:t xml:space="preserve">  Bezug L = (Ex*Ey*Ez)^(1/3) :  0.75 Dekaden   &lt;- verwendet</w:t>
+      </w:r>
+    </w:p>
+    <w:p>
+      <w:r>
+        <w:t xml:space="preserve">  Bezug L = Ex               :  2.24 Dekaden</w:t>
       </w:r>
     </w:p>
     <w:p/>
     <w:p>
       <w:r>
-        <w:t xml:space="preserve">Nach </w:t>
-      </w:r>
-      <w:proofErr w:type="spellStart"/>
-      <w:r>
-        <w:t>Entdimensionalisierung</w:t>
-      </w:r>
-      <w:proofErr w:type="spellEnd"/>
-      <w:r>
-        <w:t xml:space="preserve">, Streuung von </w:t>
-      </w:r>
-      <w:proofErr w:type="spellStart"/>
-      <w:r>
-        <w:t>std</w:t>
-      </w:r>
-      <w:proofErr w:type="spellEnd"/>
-      <w:r>
-        <w:t>(</w:t>
-      </w:r>
-      <w:proofErr w:type="spellStart"/>
-      <w:r>
-        <w:t>phi_hat</w:t>
-      </w:r>
-      <w:proofErr w:type="spellEnd"/>
-      <w:r>
-        <w:t>):</w:t>
-      </w:r>
-    </w:p>
-    <w:p>
-      <w:r>
-        <w:t xml:space="preserve">  Bezug L = (Ex*</w:t>
-      </w:r>
-      <w:proofErr w:type="spellStart"/>
-      <w:r>
-        <w:t>Ey</w:t>
-      </w:r>
-      <w:proofErr w:type="spellEnd"/>
-      <w:r>
-        <w:t>*</w:t>
-      </w:r>
-      <w:proofErr w:type="spellStart"/>
-      <w:r>
-        <w:t>Ez</w:t>
-      </w:r>
-      <w:proofErr w:type="spellEnd"/>
-      <w:r>
-        <w:t>)^(1/3) :  0.75 Dekaden   &lt;- verwendet</w:t>
-      </w:r>
-    </w:p>
-    <w:p>
-      <w:r>
-        <w:t xml:space="preserve">  Bezug L = Ex               :  2.24 Dekaden</w:t>
+        <w:t>Achsenverhaeltnisse E_i / L (gehen als log ins Netz):</w:t>
+      </w:r>
+    </w:p>
+    <w:p>
+      <w:r>
+        <w:t xml:space="preserve">  Ex/L: 3.923e-03 .. 5.708e-01</w:t>
+      </w:r>
+    </w:p>
+    <w:p>
+      <w:r>
+        <w:t xml:space="preserve">  Ey/L: 5.400e-03 .. 6.069e-01</w:t>
+      </w:r>
+    </w:p>
+    <w:p>
+      <w:r>
+        <w:t xml:space="preserve">  Ez/L: 4.432e+01 .. 6.903e+02</w:t>
       </w:r>
     </w:p>
     <w:p/>
     <w:p>
-      <w:proofErr w:type="spellStart"/>
-      <w:r>
-        <w:t>Achsenverhaeltnisse</w:t>
-      </w:r>
-      <w:proofErr w:type="spellEnd"/>
-      <w:r>
-        <w:t xml:space="preserve"> </w:t>
-      </w:r>
-      <w:proofErr w:type="spellStart"/>
-      <w:r>
-        <w:t>E_i</w:t>
-      </w:r>
-      <w:proofErr w:type="spellEnd"/>
-      <w:r>
-        <w:t xml:space="preserve"> / L (gehen als log ins Netz):</w:t>
-      </w:r>
-    </w:p>
-    <w:p>
-      <w:r>
-        <w:t xml:space="preserve">  Ex/L: 3.923e-03 .. 5.708e-01</w:t>
-      </w:r>
-    </w:p>
-    <w:p>
-      <w:r>
-        <w:t xml:space="preserve">  </w:t>
-      </w:r>
-      <w:proofErr w:type="spellStart"/>
-      <w:r>
-        <w:t>Ey</w:t>
-      </w:r>
-      <w:proofErr w:type="spellEnd"/>
-      <w:r>
-        <w:t>/L: 5.400e-03 .. 6.069e-01</w:t>
-      </w:r>
-    </w:p>
-    <w:p>
-      <w:r>
-        <w:t xml:space="preserve">  </w:t>
-      </w:r>
-      <w:proofErr w:type="spellStart"/>
-      <w:r>
-        <w:t>Ez</w:t>
-      </w:r>
-      <w:proofErr w:type="spellEnd"/>
-      <w:r>
-        <w:t>/L: 4.432e+01 .. 6.903e+02</w:t>
-      </w:r>
-    </w:p>
-    <w:p/>
-    <w:p>
-      <w:r>
-        <w:lastRenderedPageBreak/>
-        <w:t xml:space="preserve">Faustregel: bleibt die Streuung von </w:t>
-      </w:r>
-      <w:proofErr w:type="spellStart"/>
-      <w:r>
-        <w:t>phi_hat</w:t>
-      </w:r>
-      <w:proofErr w:type="spellEnd"/>
-      <w:r>
-        <w:t xml:space="preserve"> unter etwa einer Dekade,</w:t>
-      </w:r>
-    </w:p>
-    <w:p>
-      <w:r>
-        <w:t xml:space="preserve">ist die Skalierung in Ordnung. Deutlich mehr </w:t>
-      </w:r>
-      <w:proofErr w:type="spellStart"/>
-      <w:r>
-        <w:t>heisst</w:t>
-      </w:r>
-      <w:proofErr w:type="spellEnd"/>
-      <w:r>
-        <w:t>, dass eine</w:t>
-      </w:r>
-    </w:p>
-    <w:p>
-      <w:r>
-        <w:t xml:space="preserve">separate </w:t>
-      </w:r>
-      <w:proofErr w:type="spellStart"/>
-      <w:r>
-        <w:t>Skalarvorhersage</w:t>
-      </w:r>
-      <w:proofErr w:type="spellEnd"/>
-      <w:r>
-        <w:t xml:space="preserve"> (zweiter Kopf </w:t>
-      </w:r>
-      <w:proofErr w:type="spellStart"/>
-      <w:r>
-        <w:t>fuer</w:t>
-      </w:r>
-      <w:proofErr w:type="spellEnd"/>
-      <w:r>
-        <w:t xml:space="preserve"> </w:t>
-      </w:r>
-      <w:proofErr w:type="spellStart"/>
-      <w:r>
-        <w:t>log|phi</w:t>
-      </w:r>
-      <w:proofErr w:type="spellEnd"/>
-      <w:r>
-        <w:t>|) lohnt.</w:t>
+      <w:r>
+        <w:t>Faustregel: bleibt die Streuung von phi_hat unter etwa einer Dekade,</w:t>
+      </w:r>
+    </w:p>
+    <w:p>
+      <w:r>
+        <w:t>ist die Skalierung in Ordnung. Deutlich mehr heisst, dass eine</w:t>
+      </w:r>
+    </w:p>
+    <w:p>
+      <w:r>
+        <w:t>separate Skalarvorhersage (zweiter Kopf fuer log|phi|) lohnt.</w:t>
       </w:r>
     </w:p>
     <w:p/>

</xml_diff>